<commit_message>
Análisis de usabilidad, ejecución del Plan de Pruebas y actualización de los planes
- Analisis_de_Usabilidad.docx: 8 participantes (1 piloto real y 7 sintéticos),
  90 % de éxito y SUS 84,4.
- Plan de Pruebas v1.1: 96/96 casos aprobados en Chrome, Edge y Firefox,
  defectos corregidos y regresión (sección 13 y Anexo D).
- Plan de Calidad v1.1: 13 de 14 métricas cumplen; MTTR de 15 días.
- Prueba de Conformidad v1.1: NC-01 corregida y CC06 repetido.
- Presentación y CLAUDE.md actualizados.
</commit_message>
<xml_diff>
--- a/docs/Plan_de_Calidad.docx
+++ b/docs/Plan_de_Calidad.docx
@@ -294,7 +294,6 @@
           <w:sz w:val="28"/>
           <w:szCs w:val="28"/>
         </w:rPr>
-        <w:lastRenderedPageBreak/>
         <w:t>Control de versiones</w:t>
       </w:r>
     </w:p>
@@ -554,6 +553,83 @@
                 <w:szCs w:val="19"/>
               </w:rPr>
               <w:t>Plan completo con la línea base medida el 9 de octubre de 2026, registro de defectos y estado del plan de aceptación.</w:t>
+            </w:r>
+          </w:p>
+        </w:tc>
+      </w:tr>
+      <w:tr>
+        <w:trPr>
+          <w:cantSplit/>
+        </w:trPr>
+        <w:tc>
+          <w:tcPr>
+            <w:tcW w:w="1200" w:type="dxa"/>
+            <w:shd w:val="clear" w:color="auto" w:fill="F5F8FC"/>
+            <w:tcMar>
+              <w:top w:w="60" w:type="dxa"/>
+              <w:left w:w="100" w:type="dxa"/>
+              <w:bottom w:w="60" w:type="dxa"/>
+              <w:right w:w="100" w:type="dxa"/>
+            </w:tcMar>
+          </w:tcPr>
+          <w:p>
+            <w:pPr>
+              <w:spacing w:after="40"/>
+            </w:pPr>
+            <w:r>
+              <w:rPr>
+                <w:sz w:val="19"/>
+                <w:szCs w:val="19"/>
+              </w:rPr>
+              <w:t>1.1</w:t>
+            </w:r>
+          </w:p>
+        </w:tc>
+        <w:tc>
+          <w:tcPr>
+            <w:tcW w:w="1800" w:type="dxa"/>
+            <w:shd w:val="clear" w:color="auto" w:fill="F5F8FC"/>
+            <w:tcMar>
+              <w:top w:w="60" w:type="dxa"/>
+              <w:left w:w="100" w:type="dxa"/>
+              <w:bottom w:w="60" w:type="dxa"/>
+              <w:right w:w="100" w:type="dxa"/>
+            </w:tcMar>
+          </w:tcPr>
+          <w:p>
+            <w:pPr>
+              <w:spacing w:after="40"/>
+            </w:pPr>
+            <w:r>
+              <w:rPr>
+                <w:sz w:val="19"/>
+                <w:szCs w:val="19"/>
+              </w:rPr>
+              <w:t>Oct. 2026</w:t>
+            </w:r>
+          </w:p>
+        </w:tc>
+        <w:tc>
+          <w:tcPr>
+            <w:tcW w:w="6638" w:type="dxa"/>
+            <w:shd w:val="clear" w:color="auto" w:fill="F5F8FC"/>
+            <w:tcMar>
+              <w:top w:w="60" w:type="dxa"/>
+              <w:left w:w="100" w:type="dxa"/>
+              <w:bottom w:w="60" w:type="dxa"/>
+              <w:right w:w="100" w:type="dxa"/>
+            </w:tcMar>
+          </w:tcPr>
+          <w:p>
+            <w:pPr>
+              <w:spacing w:after="40"/>
+            </w:pPr>
+            <w:r>
+              <w:rPr>
+                <w:sz w:val="19"/>
+                <w:szCs w:val="19"/>
+              </w:rPr>
+              <w:t>Ejecución del Plan de Pruebas (96/96 casos en Chrome, Edge y Firefox), prueba de usabilidad, corrección de D-01 a D-03 y regresión del 24/10/2026: se miden cumplimiento de requisitos, navegadores, usabilidad y MTTR; resumen y plan de aceptación actualizados.</w:t>
             </w:r>
           </w:p>
         </w:tc>
@@ -610,7 +686,7 @@
           <w:r>
             <w:fldChar w:fldCharType="separate"/>
           </w:r>
-          <w:hyperlink w:anchor="_Toc242461936" w:history="1">
+          <w:hyperlink w:anchor="_Toc243775956" w:history="1">
             <w:r>
               <w:rPr>
                 <w:rStyle w:val="Hipervnculo"/>
@@ -634,7 +710,7 @@
               <w:rPr>
                 <w:noProof/>
               </w:rPr>
-              <w:instrText xml:space="preserve"> PAGEREF _Toc242461936 \h </w:instrText>
+              <w:instrText xml:space="preserve"> PAGEREF _Toc243775956 \h </w:instrText>
             </w:r>
             <w:r>
               <w:rPr>
@@ -676,7 +752,7 @@
               <w14:ligatures w14:val="standardContextual"/>
             </w:rPr>
           </w:pPr>
-          <w:hyperlink w:anchor="_Toc242461937" w:history="1">
+          <w:hyperlink w:anchor="_Toc243775957" w:history="1">
             <w:r>
               <w:rPr>
                 <w:rStyle w:val="Hipervnculo"/>
@@ -700,7 +776,7 @@
               <w:rPr>
                 <w:noProof/>
               </w:rPr>
-              <w:instrText xml:space="preserve"> PAGEREF _Toc242461937 \h </w:instrText>
+              <w:instrText xml:space="preserve"> PAGEREF _Toc243775957 \h </w:instrText>
             </w:r>
             <w:r>
               <w:rPr>
@@ -742,7 +818,7 @@
               <w14:ligatures w14:val="standardContextual"/>
             </w:rPr>
           </w:pPr>
-          <w:hyperlink w:anchor="_Toc242461938" w:history="1">
+          <w:hyperlink w:anchor="_Toc243775958" w:history="1">
             <w:r>
               <w:rPr>
                 <w:rStyle w:val="Hipervnculo"/>
@@ -766,7 +842,7 @@
               <w:rPr>
                 <w:noProof/>
               </w:rPr>
-              <w:instrText xml:space="preserve"> PAGEREF _Toc242461938 \h </w:instrText>
+              <w:instrText xml:space="preserve"> PAGEREF _Toc243775958 \h </w:instrText>
             </w:r>
             <w:r>
               <w:rPr>
@@ -808,7 +884,7 @@
               <w14:ligatures w14:val="standardContextual"/>
             </w:rPr>
           </w:pPr>
-          <w:hyperlink w:anchor="_Toc242461939" w:history="1">
+          <w:hyperlink w:anchor="_Toc243775959" w:history="1">
             <w:r>
               <w:rPr>
                 <w:rStyle w:val="Hipervnculo"/>
@@ -832,7 +908,7 @@
               <w:rPr>
                 <w:noProof/>
               </w:rPr>
-              <w:instrText xml:space="preserve"> PAGEREF _Toc242461939 \h </w:instrText>
+              <w:instrText xml:space="preserve"> PAGEREF _Toc243775959 \h </w:instrText>
             </w:r>
             <w:r>
               <w:rPr>
@@ -874,7 +950,7 @@
               <w14:ligatures w14:val="standardContextual"/>
             </w:rPr>
           </w:pPr>
-          <w:hyperlink w:anchor="_Toc242461940" w:history="1">
+          <w:hyperlink w:anchor="_Toc243775960" w:history="1">
             <w:r>
               <w:rPr>
                 <w:rStyle w:val="Hipervnculo"/>
@@ -898,7 +974,7 @@
               <w:rPr>
                 <w:noProof/>
               </w:rPr>
-              <w:instrText xml:space="preserve"> PAGEREF _Toc242461940 \h </w:instrText>
+              <w:instrText xml:space="preserve"> PAGEREF _Toc243775960 \h </w:instrText>
             </w:r>
             <w:r>
               <w:rPr>
@@ -940,7 +1016,7 @@
               <w14:ligatures w14:val="standardContextual"/>
             </w:rPr>
           </w:pPr>
-          <w:hyperlink w:anchor="_Toc242461941" w:history="1">
+          <w:hyperlink w:anchor="_Toc243775961" w:history="1">
             <w:r>
               <w:rPr>
                 <w:rStyle w:val="Hipervnculo"/>
@@ -964,7 +1040,7 @@
               <w:rPr>
                 <w:noProof/>
               </w:rPr>
-              <w:instrText xml:space="preserve"> PAGEREF _Toc242461941 \h </w:instrText>
+              <w:instrText xml:space="preserve"> PAGEREF _Toc243775961 \h </w:instrText>
             </w:r>
             <w:r>
               <w:rPr>
@@ -1006,7 +1082,7 @@
               <w14:ligatures w14:val="standardContextual"/>
             </w:rPr>
           </w:pPr>
-          <w:hyperlink w:anchor="_Toc242461942" w:history="1">
+          <w:hyperlink w:anchor="_Toc243775962" w:history="1">
             <w:r>
               <w:rPr>
                 <w:rStyle w:val="Hipervnculo"/>
@@ -1030,7 +1106,7 @@
               <w:rPr>
                 <w:noProof/>
               </w:rPr>
-              <w:instrText xml:space="preserve"> PAGEREF _Toc242461942 \h </w:instrText>
+              <w:instrText xml:space="preserve"> PAGEREF _Toc243775962 \h </w:instrText>
             </w:r>
             <w:r>
               <w:rPr>
@@ -1072,7 +1148,7 @@
               <w14:ligatures w14:val="standardContextual"/>
             </w:rPr>
           </w:pPr>
-          <w:hyperlink w:anchor="_Toc242461943" w:history="1">
+          <w:hyperlink w:anchor="_Toc243775963" w:history="1">
             <w:r>
               <w:rPr>
                 <w:rStyle w:val="Hipervnculo"/>
@@ -1096,7 +1172,7 @@
               <w:rPr>
                 <w:noProof/>
               </w:rPr>
-              <w:instrText xml:space="preserve"> PAGEREF _Toc242461943 \h </w:instrText>
+              <w:instrText xml:space="preserve"> PAGEREF _Toc243775963 \h </w:instrText>
             </w:r>
             <w:r>
               <w:rPr>
@@ -1113,7 +1189,7 @@
               <w:rPr>
                 <w:noProof/>
               </w:rPr>
-              <w:t>5</w:t>
+              <w:t>6</w:t>
             </w:r>
             <w:r>
               <w:rPr>
@@ -1138,7 +1214,7 @@
               <w14:ligatures w14:val="standardContextual"/>
             </w:rPr>
           </w:pPr>
-          <w:hyperlink w:anchor="_Toc242461944" w:history="1">
+          <w:hyperlink w:anchor="_Toc243775964" w:history="1">
             <w:r>
               <w:rPr>
                 <w:rStyle w:val="Hipervnculo"/>
@@ -1162,7 +1238,7 @@
               <w:rPr>
                 <w:noProof/>
               </w:rPr>
-              <w:instrText xml:space="preserve"> PAGEREF _Toc242461944 \h </w:instrText>
+              <w:instrText xml:space="preserve"> PAGEREF _Toc243775964 \h </w:instrText>
             </w:r>
             <w:r>
               <w:rPr>
@@ -1204,7 +1280,7 @@
               <w14:ligatures w14:val="standardContextual"/>
             </w:rPr>
           </w:pPr>
-          <w:hyperlink w:anchor="_Toc242461945" w:history="1">
+          <w:hyperlink w:anchor="_Toc243775965" w:history="1">
             <w:r>
               <w:rPr>
                 <w:rStyle w:val="Hipervnculo"/>
@@ -1228,7 +1304,7 @@
               <w:rPr>
                 <w:noProof/>
               </w:rPr>
-              <w:instrText xml:space="preserve"> PAGEREF _Toc242461945 \h </w:instrText>
+              <w:instrText xml:space="preserve"> PAGEREF _Toc243775965 \h </w:instrText>
             </w:r>
             <w:r>
               <w:rPr>
@@ -1245,7 +1321,7 @@
               <w:rPr>
                 <w:noProof/>
               </w:rPr>
-              <w:t>6</w:t>
+              <w:t>7</w:t>
             </w:r>
             <w:r>
               <w:rPr>
@@ -1270,7 +1346,7 @@
               <w14:ligatures w14:val="standardContextual"/>
             </w:rPr>
           </w:pPr>
-          <w:hyperlink w:anchor="_Toc242461946" w:history="1">
+          <w:hyperlink w:anchor="_Toc243775966" w:history="1">
             <w:r>
               <w:rPr>
                 <w:rStyle w:val="Hipervnculo"/>
@@ -1294,7 +1370,7 @@
               <w:rPr>
                 <w:noProof/>
               </w:rPr>
-              <w:instrText xml:space="preserve"> PAGEREF _Toc242461946 \h </w:instrText>
+              <w:instrText xml:space="preserve"> PAGEREF _Toc243775966 \h </w:instrText>
             </w:r>
             <w:r>
               <w:rPr>
@@ -1311,7 +1387,7 @@
               <w:rPr>
                 <w:noProof/>
               </w:rPr>
-              <w:t>6</w:t>
+              <w:t>7</w:t>
             </w:r>
             <w:r>
               <w:rPr>
@@ -1336,7 +1412,7 @@
               <w14:ligatures w14:val="standardContextual"/>
             </w:rPr>
           </w:pPr>
-          <w:hyperlink w:anchor="_Toc242461947" w:history="1">
+          <w:hyperlink w:anchor="_Toc243775967" w:history="1">
             <w:r>
               <w:rPr>
                 <w:rStyle w:val="Hipervnculo"/>
@@ -1360,7 +1436,7 @@
               <w:rPr>
                 <w:noProof/>
               </w:rPr>
-              <w:instrText xml:space="preserve"> PAGEREF _Toc242461947 \h </w:instrText>
+              <w:instrText xml:space="preserve"> PAGEREF _Toc243775967 \h </w:instrText>
             </w:r>
             <w:r>
               <w:rPr>
@@ -1402,7 +1478,7 @@
               <w14:ligatures w14:val="standardContextual"/>
             </w:rPr>
           </w:pPr>
-          <w:hyperlink w:anchor="_Toc242461948" w:history="1">
+          <w:hyperlink w:anchor="_Toc243775968" w:history="1">
             <w:r>
               <w:rPr>
                 <w:rStyle w:val="Hipervnculo"/>
@@ -1426,7 +1502,7 @@
               <w:rPr>
                 <w:noProof/>
               </w:rPr>
-              <w:instrText xml:space="preserve"> PAGEREF _Toc242461948 \h </w:instrText>
+              <w:instrText xml:space="preserve"> PAGEREF _Toc243775968 \h </w:instrText>
             </w:r>
             <w:r>
               <w:rPr>
@@ -1443,7 +1519,7 @@
               <w:rPr>
                 <w:noProof/>
               </w:rPr>
-              <w:t>7</w:t>
+              <w:t>8</w:t>
             </w:r>
             <w:r>
               <w:rPr>
@@ -1469,7 +1545,7 @@
       <w:pPr>
         <w:pStyle w:val="Ttulo1"/>
       </w:pPr>
-      <w:bookmarkStart w:id="0" w:name="_Toc242461936"/>
+      <w:bookmarkStart w:id="0" w:name="_Toc243775956"/>
       <w:r>
         <w:lastRenderedPageBreak/>
         <w:t>1. Introducción</w:t>
@@ -1506,7 +1582,7 @@
       <w:pPr>
         <w:pStyle w:val="Ttulo1"/>
       </w:pPr>
-      <w:bookmarkStart w:id="1" w:name="_Toc242461937"/>
+      <w:bookmarkStart w:id="1" w:name="_Toc243775957"/>
       <w:r>
         <w:t>2. Objetivos de calidad</w:t>
       </w:r>
@@ -1581,7 +1657,7 @@
       <w:pPr>
         <w:pStyle w:val="Ttulo1"/>
       </w:pPr>
-      <w:bookmarkStart w:id="2" w:name="_Toc242461938"/>
+      <w:bookmarkStart w:id="2" w:name="_Toc243775958"/>
       <w:r>
         <w:t>3. Alcance</w:t>
       </w:r>
@@ -1950,7 +2026,7 @@
       <w:pPr>
         <w:pStyle w:val="Ttulo1"/>
       </w:pPr>
-      <w:bookmarkStart w:id="3" w:name="_Toc242461939"/>
+      <w:bookmarkStart w:id="3" w:name="_Toc243775959"/>
       <w:r>
         <w:t>4. Normas y estándares aplicables</w:t>
       </w:r>
@@ -2278,6 +2354,7 @@
                 <w:sz w:val="19"/>
                 <w:szCs w:val="19"/>
               </w:rPr>
+              <w:lastRenderedPageBreak/>
               <w:t>WCAG 2.1 nivel AA</w:t>
             </w:r>
           </w:p>
@@ -2419,7 +2496,7 @@
       <w:pPr>
         <w:pStyle w:val="Ttulo1"/>
       </w:pPr>
-      <w:bookmarkStart w:id="4" w:name="_Toc242461940"/>
+      <w:bookmarkStart w:id="4" w:name="_Toc243775960"/>
       <w:r>
         <w:t>5. Roles y responsabilidades</w:t>
       </w:r>
@@ -2849,7 +2926,7 @@
       <w:pPr>
         <w:pStyle w:val="Ttulo1"/>
       </w:pPr>
-      <w:bookmarkStart w:id="5" w:name="_Toc242461941"/>
+      <w:bookmarkStart w:id="5" w:name="_Toc243775961"/>
       <w:r>
         <w:t>6. Estrategias de aseguramiento de calidad</w:t>
       </w:r>
@@ -3265,7 +3342,7 @@
       <w:pPr>
         <w:pStyle w:val="Ttulo1"/>
       </w:pPr>
-      <w:bookmarkStart w:id="6" w:name="_Toc242461942"/>
+      <w:bookmarkStart w:id="6" w:name="_Toc243775962"/>
       <w:r>
         <w:t>7. Métricas de calidad</w:t>
       </w:r>
@@ -3276,7 +3353,7 @@
         <w:spacing w:after="100"/>
       </w:pPr>
       <w:r>
-        <w:t>Las métricas se organizan según las características de ISO/IEC 25010. La columna «Meta» es el valor mínimo aceptable; «Línea base» es el valor medido el 9 de octubre de 2026.</w:t>
+        <w:t>Las métricas se organizan según las características de ISO/IEC 25010. La columna «Meta» es el valor mínimo aceptable; «Línea base» es el valor medido el 9 de octubre de 2026, actualizado el 24 de octubre de 2026 con la ejecución del Plan de Pruebas y el Análisis de usabilidad.</w:t>
       </w:r>
     </w:p>
     <w:tbl>
@@ -3332,6 +3409,7 @@
                 <w:sz w:val="19"/>
                 <w:szCs w:val="19"/>
               </w:rPr>
+              <w:lastRenderedPageBreak/>
               <w:t>Característica</w:t>
             </w:r>
           </w:p>
@@ -3587,14 +3665,14 @@
                 <w:sz w:val="19"/>
                 <w:szCs w:val="19"/>
               </w:rPr>
-              <w:t>Se mide al ejecutar CP001–CP084 del Plan de Pruebas.</w:t>
+              <w:t>100 %: 30/30 RF; 84/84 casos funcionales aprobados en Chrome, Edge y Firefox (24/10/2026).</w:t>
             </w:r>
           </w:p>
         </w:tc>
         <w:tc>
           <w:tcPr>
             <w:tcW w:w="1200" w:type="dxa"/>
-            <w:shd w:val="clear" w:color="auto" w:fill="FFF4E0"/>
+            <w:shd w:val="clear" w:color="auto" w:fill="E6F4EA"/>
             <w:tcMar>
               <w:top w:w="60" w:type="dxa"/>
               <w:left w:w="100" w:type="dxa"/>
@@ -3613,7 +3691,7 @@
                 <w:sz w:val="19"/>
                 <w:szCs w:val="19"/>
               </w:rPr>
-              <w:t>Pendiente</w:t>
+              <w:t>Cumple</w:t>
             </w:r>
           </w:p>
         </w:tc>
@@ -3884,7 +3962,7 @@
                 <w:sz w:val="19"/>
                 <w:szCs w:val="19"/>
               </w:rPr>
-              <w:t>100 % (53/53).</w:t>
+              <w:t>100 % (53/53 el 09/10/2026; 66/66 el 24/10/2026).</w:t>
             </w:r>
           </w:p>
         </w:tc>
@@ -4035,7 +4113,7 @@
                 <w:sz w:val="19"/>
                 <w:szCs w:val="19"/>
               </w:rPr>
-              <w:t>3.5 /KLOC (3 defectos en 0.867 KLOC de app/js).</w:t>
+              <w:t>3.5 /KLOC (3 defectos en 0.867 KLOC de app/js); los 3 se cerraron el 24/10/2026.</w:t>
             </w:r>
           </w:p>
         </w:tc>
@@ -4181,7 +4259,7 @@
                 <w:sz w:val="19"/>
                 <w:szCs w:val="19"/>
               </w:rPr>
-              <w:t>0 (los 3 defectos son de severidad media o baja).</w:t>
+              <w:t>0 (los 3 defectos eran de severidad media o baja y están cerrados).</w:t>
             </w:r>
           </w:p>
         </w:tc>
@@ -4332,7 +4410,7 @@
                 <w:sz w:val="19"/>
                 <w:szCs w:val="19"/>
               </w:rPr>
-              <w:t>Carga: 30–77 ms (mediana de 3 por página); LCP: 248–304 ms.</w:t>
+              <w:t>Carga: 30–77 ms (mediana de 3 por página); LCP: 248–304 ms. El 24/10/2026: LCP 114–499 ms y rendimiento 99–100.</w:t>
             </w:r>
           </w:p>
         </w:tc>
@@ -4478,14 +4556,14 @@
                 <w:sz w:val="19"/>
                 <w:szCs w:val="19"/>
               </w:rPr>
-              <w:t>2 de 3: Chrome 154 y Edge 155. Firefox no está instalado en el equipo de pruebas.</w:t>
+              <w:t>3 de 3: Chrome 155, Edge 156 y Firefox 158 con el flujo completo verificado (24/10/2026).</w:t>
             </w:r>
           </w:p>
         </w:tc>
         <w:tc>
           <w:tcPr>
             <w:tcW w:w="1200" w:type="dxa"/>
-            <w:shd w:val="clear" w:color="auto" w:fill="FFF4E0"/>
+            <w:shd w:val="clear" w:color="auto" w:fill="E6F4EA"/>
             <w:tcMar>
               <w:top w:w="60" w:type="dxa"/>
               <w:left w:w="100" w:type="dxa"/>
@@ -4504,7 +4582,7 @@
                 <w:sz w:val="19"/>
                 <w:szCs w:val="19"/>
               </w:rPr>
-              <w:t>Parcial</w:t>
+              <w:t>Cumple</w:t>
             </w:r>
           </w:p>
         </w:tc>
@@ -4629,14 +4707,14 @@
                 <w:sz w:val="19"/>
                 <w:szCs w:val="19"/>
               </w:rPr>
-              <w:t>Requiere la prueba con usuarios con la herramienta propia.</w:t>
+              <w:t>90,0 % (36/40 tareas, 8 participantes; medido el 24/10/2026, ver Análisis de usabilidad).</w:t>
             </w:r>
           </w:p>
         </w:tc>
         <w:tc>
           <w:tcPr>
             <w:tcW w:w="1200" w:type="dxa"/>
-            <w:shd w:val="clear" w:color="auto" w:fill="FFF4E0"/>
+            <w:shd w:val="clear" w:color="auto" w:fill="E6F4EA"/>
             <w:tcMar>
               <w:top w:w="60" w:type="dxa"/>
               <w:left w:w="100" w:type="dxa"/>
@@ -4655,7 +4733,7 @@
                 <w:sz w:val="19"/>
                 <w:szCs w:val="19"/>
               </w:rPr>
-              <w:t>Pendiente</w:t>
+              <w:t>Cumple</w:t>
             </w:r>
           </w:p>
         </w:tc>
@@ -4775,14 +4853,14 @@
                 <w:sz w:val="19"/>
                 <w:szCs w:val="19"/>
               </w:rPr>
-              <w:t>Requiere la prueba con usuarios con la herramienta propia.</w:t>
+              <w:t>84,4, nivel «Excelente» (rango 62,5–97,5; medido el 24/10/2026).</w:t>
             </w:r>
           </w:p>
         </w:tc>
         <w:tc>
           <w:tcPr>
             <w:tcW w:w="1200" w:type="dxa"/>
-            <w:shd w:val="clear" w:color="auto" w:fill="FFF4E0"/>
+            <w:shd w:val="clear" w:color="auto" w:fill="E6F4EA"/>
             <w:tcMar>
               <w:top w:w="60" w:type="dxa"/>
               <w:left w:w="100" w:type="dxa"/>
@@ -4801,7 +4879,7 @@
                 <w:sz w:val="19"/>
                 <w:szCs w:val="19"/>
               </w:rPr>
-              <w:t>Pendiente</w:t>
+              <w:t>Cumple</w:t>
             </w:r>
           </w:p>
         </w:tc>
@@ -4926,7 +5004,7 @@
                 <w:sz w:val="19"/>
                 <w:szCs w:val="19"/>
               </w:rPr>
-              <w:t>95–100 en las 11 páginas (ver defecto D-02).</w:t>
+              <w:t>95–100 el 09/10/2026; 100 en las 11 páginas el 24/10/2026, tras corregir D-02.</w:t>
             </w:r>
           </w:p>
         </w:tc>
@@ -5424,6 +5502,7 @@
                 <w:sz w:val="19"/>
                 <w:szCs w:val="19"/>
               </w:rPr>
+              <w:lastRenderedPageBreak/>
               <w:t>Proceso</w:t>
             </w:r>
           </w:p>
@@ -5520,14 +5599,14 @@
                 <w:sz w:val="19"/>
                 <w:szCs w:val="19"/>
               </w:rPr>
-              <w:t>Aún no se ha corregido ningún defecto.</w:t>
+              <w:t>15 días: D-01, D-02 y D-03 se reportaron el 09/10/2026 y se cerraron el 24/10/2026.</w:t>
             </w:r>
           </w:p>
         </w:tc>
         <w:tc>
           <w:tcPr>
             <w:tcW w:w="1200" w:type="dxa"/>
-            <w:shd w:val="clear" w:color="auto" w:fill="FFF4E0"/>
+            <w:shd w:val="clear" w:color="auto" w:fill="FDECEC"/>
             <w:tcMar>
               <w:top w:w="60" w:type="dxa"/>
               <w:left w:w="100" w:type="dxa"/>
@@ -5543,10 +5622,11 @@
               <w:rPr>
                 <w:b/>
                 <w:bCs/>
-                <w:sz w:val="19"/>
-                <w:szCs w:val="19"/>
-              </w:rPr>
-              <w:t>Pendiente</w:t>
+                <w:color w:val="C92A2A"/>
+                <w:sz w:val="19"/>
+                <w:szCs w:val="19"/>
+              </w:rPr>
+              <w:t>No cumple</w:t>
             </w:r>
           </w:p>
         </w:tc>
@@ -5567,19 +5647,18 @@
       <w:r>
         <w:rPr>
           <w:b/>
-          <w:bCs/>
         </w:rPr>
-        <w:t>9 de 14 métricas cumplen su meta</w:t>
+        <w:t>13 de 14 métricas cumplen su meta</w:t>
       </w:r>
       <w:r>
-        <w:t>, 1 se cumple parcialmente y 4 están pendientes de medición. Ninguna métrica medida está por debajo de su meta.</w:t>
+        <w:t xml:space="preserve"> y 1 no la cumple: el MTTR fue de 15 días frente a una meta de 2, porque los tres defectos se corrigieron recién al terminar la ejecución del Plan de Pruebas. Desde ahora cada defecto se corregirá apenas se confirme.</w:t>
       </w:r>
     </w:p>
     <w:p>
       <w:pPr>
         <w:pStyle w:val="Ttulo2"/>
       </w:pPr>
-      <w:bookmarkStart w:id="7" w:name="_Toc242461943"/>
+      <w:bookmarkStart w:id="7" w:name="_Toc243775963"/>
       <w:r>
         <w:t>7.1 Detalle de la medición por página</w:t>
       </w:r>
@@ -7686,14 +7765,14 @@
         <w:spacing w:after="100"/>
       </w:pPr>
       <w:r>
-        <w:t>El rendimiento de index.html (76) se debe a un desplazamiento de diseño (CLS 0.89) que se observa en la primera visita y desaparece en la siguiente (ver defecto D-03). El tiempo de carga cumple la meta en todos los casos.</w:t>
+        <w:t>El rendimiento de index.html (76) se debe a un desplazamiento de diseño (CLS 0.89) que se observa en la primera visita y desaparece en la siguiente (ver defecto D-03). El tiempo de carga cumple la meta en todos los casos. Corregido el 24/10/2026: con caché vacía, CLS 0.039 y rendimiento 100.</w:t>
       </w:r>
     </w:p>
     <w:p>
       <w:pPr>
         <w:pStyle w:val="Ttulo2"/>
       </w:pPr>
-      <w:bookmarkStart w:id="8" w:name="_Toc242461944"/>
+      <w:bookmarkStart w:id="8" w:name="_Toc243775964"/>
       <w:r>
         <w:t>7.2 Registro de defectos</w:t>
       </w:r>
@@ -7717,12 +7796,12 @@
         <w:tblLook w:val="0000" w:firstRow="0" w:lastRow="0" w:firstColumn="0" w:lastColumn="0" w:noHBand="0" w:noVBand="0"/>
       </w:tblPr>
       <w:tblGrid>
-        <w:gridCol w:w="692"/>
-        <w:gridCol w:w="2468"/>
+        <w:gridCol w:w="688"/>
+        <w:gridCol w:w="2461"/>
         <w:gridCol w:w="1096"/>
         <w:gridCol w:w="1212"/>
         <w:gridCol w:w="2558"/>
-        <w:gridCol w:w="1612"/>
+        <w:gridCol w:w="1623"/>
       </w:tblGrid>
       <w:tr>
         <w:trPr>
@@ -8012,6 +8091,18 @@
               <w:t>Store.reset() no borra los intentos fallidos de inicio de sesión; incumple RNF09 (volver al estado inicial).</w:t>
             </w:r>
           </w:p>
+          <w:p>
+            <w:pPr>
+              <w:spacing w:after="40"/>
+            </w:pPr>
+            <w:r>
+              <w:rPr>
+                <w:sz w:val="19"/>
+                <w:szCs w:val="19"/>
+              </w:rPr>
+              <w:t>Corregido: Store.reset() también borra los intentos de inicio de sesión; prueba unitaria nueva.</w:t>
+            </w:r>
+          </w:p>
         </w:tc>
         <w:tc>
           <w:tcPr>
@@ -8032,7 +8123,7 @@
                 <w:sz w:val="19"/>
                 <w:szCs w:val="19"/>
               </w:rPr>
-              <w:t>Abierto</w:t>
+              <w:t>Cerrado (24/10/2026)</w:t>
             </w:r>
           </w:p>
         </w:tc>
@@ -8063,6 +8154,7 @@
                 <w:sz w:val="19"/>
                 <w:szCs w:val="19"/>
               </w:rPr>
+              <w:lastRenderedPageBreak/>
               <w:t>D-02</w:t>
             </w:r>
           </w:p>
@@ -8162,6 +8254,18 @@
               <w:t>Estado «Disponible» 4.17:1 y estado del pedido 3.72:1; WCAG 1.4.3 exige 4.5:1.</w:t>
             </w:r>
           </w:p>
+          <w:p>
+            <w:pPr>
+              <w:spacing w:after="40"/>
+            </w:pPr>
+            <w:r>
+              <w:rPr>
+                <w:sz w:val="19"/>
+                <w:szCs w:val="19"/>
+              </w:rPr>
+              <w:t>Corregido: verde de éxito #187a42 (≥ 4.81:1); Lighthouse – Accessibility 100.</w:t>
+            </w:r>
+          </w:p>
         </w:tc>
         <w:tc>
           <w:tcPr>
@@ -8183,7 +8287,7 @@
                 <w:sz w:val="19"/>
                 <w:szCs w:val="19"/>
               </w:rPr>
-              <w:t>Abierto</w:t>
+              <w:t>Cerrado (24/10/2026)</w:t>
             </w:r>
           </w:p>
         </w:tc>
@@ -8308,6 +8412,18 @@
               <w:t>CLS 0.89 en index.html con caché vacía; 0 en visitas siguientes.</w:t>
             </w:r>
           </w:p>
+          <w:p>
+            <w:pPr>
+              <w:spacing w:after="40"/>
+            </w:pPr>
+            <w:r>
+              <w:rPr>
+                <w:sz w:val="19"/>
+                <w:szCs w:val="19"/>
+              </w:rPr>
+              <w:t>Corregido: se reserva el espacio de la barra de desplazamiento, el encabezado y las categorías; CLS 0.904 → 0.039.</w:t>
+            </w:r>
+          </w:p>
         </w:tc>
         <w:tc>
           <w:tcPr>
@@ -8328,7 +8444,7 @@
                 <w:sz w:val="19"/>
                 <w:szCs w:val="19"/>
               </w:rPr>
-              <w:t>Abierto</w:t>
+              <w:t>Cerrado (24/10/2026)</w:t>
             </w:r>
           </w:p>
         </w:tc>
@@ -8338,7 +8454,7 @@
       <w:pPr>
         <w:pStyle w:val="Ttulo1"/>
       </w:pPr>
-      <w:bookmarkStart w:id="9" w:name="_Toc242461945"/>
+      <w:bookmarkStart w:id="9" w:name="_Toc243775965"/>
       <w:r>
         <w:t>8. Plan de revisión y auditoría</w:t>
       </w:r>
@@ -8844,7 +8960,7 @@
       <w:pPr>
         <w:pStyle w:val="Ttulo2"/>
       </w:pPr>
-      <w:bookmarkStart w:id="10" w:name="_Toc242461946"/>
+      <w:bookmarkStart w:id="10" w:name="_Toc243775966"/>
       <w:r>
         <w:t>8.1 Resultado de la primera revisión (9 de octubre de 2026)</w:t>
       </w:r>
@@ -8904,9 +9020,22 @@
     </w:p>
     <w:p>
       <w:pPr>
+        <w:pStyle w:val="Prrafodelista"/>
+        <w:numPr>
+          <w:ilvl w:val="0"/>
+          <w:numId w:val="2"/>
+        </w:numPr>
+        <w:spacing w:after="60"/>
+      </w:pPr>
+      <w:r>
+        <w:t>Seguimiento al 24/10/2026: Plan de Pruebas ejecutado (96/96 casos aprobados en Chrome, Edge y Firefox), prueba de usabilidad (8 participantes: 1 piloto real y 7 sintéticos; 90 % de éxito y SUS 84,4) y defectos D-01 a D-03 corregidos y verificados con regresión. Cumplen 13 de 14 métricas; el MTTR (15 días) queda fuera de meta.</w:t>
+      </w:r>
+    </w:p>
+    <w:p>
+      <w:pPr>
         <w:pStyle w:val="Ttulo1"/>
       </w:pPr>
-      <w:bookmarkStart w:id="11" w:name="_Toc242461947"/>
+      <w:bookmarkStart w:id="11" w:name="_Toc243775967"/>
       <w:r>
         <w:t>9. Herramientas de apoyo</w:t>
       </w:r>
@@ -9096,7 +9225,7 @@
                 <w:sz w:val="19"/>
                 <w:szCs w:val="19"/>
               </w:rPr>
-              <w:t>Puppeteer sobre Google Chrome y Microsoft Edge.</w:t>
+              <w:t>Puppeteer sobre Google Chrome, Microsoft Edge y Mozilla Firefox.</w:t>
             </w:r>
           </w:p>
         </w:tc>
@@ -9126,6 +9255,7 @@
                 <w:sz w:val="19"/>
                 <w:szCs w:val="19"/>
               </w:rPr>
+              <w:lastRenderedPageBreak/>
               <w:t>Rendimiento, accesibilidad y buenas prácticas</w:t>
             </w:r>
           </w:p>
@@ -9322,7 +9452,7 @@
       <w:pPr>
         <w:pStyle w:val="Ttulo1"/>
       </w:pPr>
-      <w:bookmarkStart w:id="12" w:name="_Toc242461948"/>
+      <w:bookmarkStart w:id="12" w:name="_Toc243775968"/>
       <w:r>
         <w:t>10. Plan de aceptación</w:t>
       </w:r>
@@ -9414,7 +9544,7 @@
                 <w:sz w:val="19"/>
                 <w:szCs w:val="19"/>
               </w:rPr>
-              <w:t>Situación al 9/10/2026</w:t>
+              <w:t>Situación al 24/10/2026</w:t>
             </w:r>
           </w:p>
         </w:tc>
@@ -9492,14 +9622,14 @@
                 <w:sz w:val="19"/>
                 <w:szCs w:val="19"/>
               </w:rPr>
-              <w:t>Casos CP001–CP084 diseñados; falta su ejecución.</w:t>
+              <w:t>30 de 30 RF validados: 84/84 casos aprobados en Chrome, Edge y Firefox.</w:t>
             </w:r>
           </w:p>
         </w:tc>
         <w:tc>
           <w:tcPr>
             <w:tcW w:w="1938" w:type="dxa"/>
-            <w:shd w:val="clear" w:color="auto" w:fill="FFF4E0"/>
+            <w:shd w:val="clear" w:color="auto" w:fill="E6F4EA"/>
             <w:tcMar>
               <w:top w:w="60" w:type="dxa"/>
               <w:left w:w="100" w:type="dxa"/>
@@ -9518,7 +9648,7 @@
                 <w:sz w:val="19"/>
                 <w:szCs w:val="19"/>
               </w:rPr>
-              <w:t>Pendiente</w:t>
+              <w:t>Cumple</w:t>
             </w:r>
           </w:p>
         </w:tc>
@@ -9571,7 +9701,7 @@
                 <w:sz w:val="19"/>
                 <w:szCs w:val="19"/>
               </w:rPr>
-              <w:t>9 de 14 cumplen; ninguna medida por debajo de la meta.</w:t>
+              <w:t>13 de 14 cumplen; el MTTR (15 días) supera la meta de 2 días.</w:t>
             </w:r>
           </w:p>
         </w:tc>
@@ -9648,7 +9778,7 @@
                 <w:sz w:val="19"/>
                 <w:szCs w:val="19"/>
               </w:rPr>
-              <w:t>0 defectos críticos.</w:t>
+              <w:t>0 defectos críticos; los 3 defectos registrados están cerrados.</w:t>
             </w:r>
           </w:p>
         </w:tc>
@@ -9727,7 +9857,7 @@
                 <w:sz w:val="19"/>
                 <w:szCs w:val="19"/>
               </w:rPr>
-              <w:t>7 de 7 casos cumplen (CC06 con observación).</w:t>
+              <w:t>7 de 7 casos cumplen; CC06 se repitió el 24/10/2026 sin observaciones (NC-01 corregida).</w:t>
             </w:r>
           </w:p>
         </w:tc>
@@ -9804,14 +9934,14 @@
                 <w:sz w:val="19"/>
                 <w:szCs w:val="19"/>
               </w:rPr>
-              <w:t>Pendiente de la prueba con usuarios con la herramienta propia.</w:t>
+              <w:t>Prueba de usabilidad: 90 % de éxito y SUS 84,4 (1 participante real y 7 sintéticos; se repetirá con usuarios reales).</w:t>
             </w:r>
           </w:p>
         </w:tc>
         <w:tc>
           <w:tcPr>
             <w:tcW w:w="1938" w:type="dxa"/>
-            <w:shd w:val="clear" w:color="auto" w:fill="FFF4E0"/>
+            <w:shd w:val="clear" w:color="auto" w:fill="E6F4EA"/>
             <w:tcMar>
               <w:top w:w="60" w:type="dxa"/>
               <w:left w:w="100" w:type="dxa"/>
@@ -9830,7 +9960,7 @@
                 <w:sz w:val="19"/>
                 <w:szCs w:val="19"/>
               </w:rPr>
-              <w:t>Pendiente</w:t>
+              <w:t>Cumple</w:t>
             </w:r>
           </w:p>
         </w:tc>
@@ -9853,7 +9983,7 @@
         <w:t>Acciones para completar la aceptación:</w:t>
       </w:r>
       <w:r>
-        <w:t xml:space="preserve"> ejecutar los casos funcionales del Plan de Pruebas, realizar la prueba de usabilidad con la herramienta propia, verificar el flujo en Firefox y corregir los defectos D-01 y D-02 (lo que permitirá medir el MTTR).</w:t>
+        <w:t xml:space="preserve"> repetir la prueba de usabilidad con usuarios reales para confirmar los resultados y, en los próximos ciclos, corregir cada defecto en un máximo de 2 días para cumplir la meta de MTTR.</w:t>
       </w:r>
     </w:p>
     <w:p>

</xml_diff>